<commit_message>
Vytvoření tabulek v Entity Frameworku
</commit_message>
<xml_diff>
--- a/Návrh/Databáze.docx
+++ b/Návrh/Databáze.docx
@@ -69,16 +69,12 @@
     </w:p>
     <w:p>
       <w:r>
-        <w:t>Klíčová</w:t>
-      </w:r>
-      <w:r>
-        <w:t>_</w:t>
-      </w:r>
-      <w:r>
-        <w:t>slova</w:t>
-      </w:r>
-      <w:r>
-        <w:t>_ID</w:t>
+        <w:t>Email</w:t>
+      </w:r>
+    </w:p>
+    <w:p>
+      <w:r>
+        <w:t>Heslo</w:t>
       </w:r>
     </w:p>
     <w:p>
@@ -194,6 +190,7 @@
           <w:b/>
           <w:bCs/>
         </w:rPr>
+        <w:lastRenderedPageBreak/>
         <w:t>Nabídka</w:t>
       </w:r>
       <w:r>
@@ -202,6 +199,187 @@
           <w:bCs/>
         </w:rPr>
         <w:t>, Preference, Požadavek</w:t>
+      </w:r>
+    </w:p>
+    <w:p>
+      <w:r>
+        <w:t>Id</w:t>
+      </w:r>
+    </w:p>
+    <w:p>
+      <w:r>
+        <w:t>Typ (Nabídka, Preference, Požadavek)</w:t>
+      </w:r>
+    </w:p>
+    <w:p>
+      <w:r>
+        <w:t>Účet_ID</w:t>
+      </w:r>
+    </w:p>
+    <w:p>
+      <w:r>
+        <w:t>Text</w:t>
+      </w:r>
+    </w:p>
+    <w:p/>
+    <w:p>
+      <w:r>
+        <w:rPr>
+          <w:b/>
+          <w:bCs/>
+        </w:rPr>
+        <w:t>Zkušenost</w:t>
+      </w:r>
+    </w:p>
+    <w:p>
+      <w:r>
+        <w:t>Id</w:t>
+      </w:r>
+    </w:p>
+    <w:p>
+      <w:r>
+        <w:t>Účet_ID</w:t>
+      </w:r>
+    </w:p>
+    <w:p>
+      <w:r>
+        <w:t>Text</w:t>
+      </w:r>
+    </w:p>
+    <w:p>
+      <w:r>
+        <w:t>Procento</w:t>
+      </w:r>
+    </w:p>
+    <w:p/>
+    <w:p>
+      <w:pPr>
+        <w:rPr>
+          <w:b/>
+          <w:bCs/>
+        </w:rPr>
+      </w:pPr>
+      <w:r>
+        <w:rPr>
+          <w:b/>
+          <w:bCs/>
+        </w:rPr>
+        <w:t>Chat</w:t>
+      </w:r>
+      <w:r>
+        <w:rPr>
+          <w:b/>
+          <w:bCs/>
+        </w:rPr>
+        <w:t xml:space="preserve"> – Spojovací tabulka</w:t>
+      </w:r>
+    </w:p>
+    <w:p>
+      <w:r>
+        <w:t>Účet_ID_1</w:t>
+      </w:r>
+    </w:p>
+    <w:p>
+      <w:r>
+        <w:t>Účet_ID_2</w:t>
+      </w:r>
+    </w:p>
+    <w:p/>
+    <w:p>
+      <w:r>
+        <w:rPr>
+          <w:b/>
+          <w:bCs/>
+        </w:rPr>
+        <w:t>Chat</w:t>
+      </w:r>
+    </w:p>
+    <w:p>
+      <w:r>
+        <w:t>Id</w:t>
+      </w:r>
+    </w:p>
+    <w:p>
+      <w:r>
+        <w:t>Chat_ID</w:t>
+      </w:r>
+    </w:p>
+    <w:p>
+      <w:r>
+        <w:t>Datum a čas</w:t>
+      </w:r>
+    </w:p>
+    <w:p>
+      <w:r>
+        <w:t>Text</w:t>
+      </w:r>
+    </w:p>
+    <w:p/>
+    <w:p>
+      <w:pPr>
+        <w:rPr>
+          <w:b/>
+          <w:bCs/>
+        </w:rPr>
+      </w:pPr>
+      <w:r>
+        <w:rPr>
+          <w:b/>
+          <w:bCs/>
+        </w:rPr>
+        <w:t>Hodnocení</w:t>
+      </w:r>
+    </w:p>
+    <w:p>
+      <w:r>
+        <w:t>Id</w:t>
+      </w:r>
+    </w:p>
+    <w:p>
+      <w:r>
+        <w:t>Zkušenost</w:t>
+      </w:r>
+      <w:r>
+        <w:t xml:space="preserve">_ID </w:t>
+      </w:r>
+      <w:r>
+        <w:t>(Adresát)</w:t>
+      </w:r>
+    </w:p>
+    <w:p>
+      <w:r>
+        <w:t>Datum a čas</w:t>
+      </w:r>
+    </w:p>
+    <w:p>
+      <w:r>
+        <w:t>Procento</w:t>
+      </w:r>
+    </w:p>
+    <w:p>
+      <w:r>
+        <w:t>Popis</w:t>
+      </w:r>
+    </w:p>
+    <w:p>
+      <w:r>
+        <w:t>Účet_ID (Hodnotitel)</w:t>
+      </w:r>
+    </w:p>
+    <w:p/>
+    <w:p>
+      <w:pPr>
+        <w:rPr>
+          <w:b/>
+          <w:bCs/>
+        </w:rPr>
+      </w:pPr>
+      <w:r>
+        <w:rPr>
+          <w:b/>
+          <w:bCs/>
+        </w:rPr>
+        <w:t>Pracovní vztah</w:t>
       </w:r>
     </w:p>
     <w:p>
@@ -212,7 +390,100 @@
     </w:p>
     <w:p>
       <w:r>
-        <w:t>Typ (Nabídka, Preference, Požadavek)</w:t>
+        <w:t>Účet_ID_1</w:t>
+      </w:r>
+    </w:p>
+    <w:p>
+      <w:r>
+        <w:t>Účet_ID_2</w:t>
+      </w:r>
+    </w:p>
+    <w:p/>
+    <w:p>
+      <w:pPr>
+        <w:rPr>
+          <w:b/>
+          <w:bCs/>
+        </w:rPr>
+      </w:pPr>
+      <w:r>
+        <w:rPr>
+          <w:b/>
+          <w:bCs/>
+        </w:rPr>
+        <w:t>Pracovní období</w:t>
+      </w:r>
+    </w:p>
+    <w:p>
+      <w:r>
+        <w:t>Id</w:t>
+      </w:r>
+    </w:p>
+    <w:p>
+      <w:r>
+        <w:t>Pracovní_vztah_ID</w:t>
+      </w:r>
+    </w:p>
+    <w:p>
+      <w:r>
+        <w:t>Od (datum, povinný)</w:t>
+      </w:r>
+    </w:p>
+    <w:p>
+      <w:r>
+        <w:t>Do (datum, možnost null)</w:t>
+      </w:r>
+    </w:p>
+    <w:p/>
+    <w:p>
+      <w:pPr>
+        <w:rPr>
+          <w:b/>
+          <w:bCs/>
+        </w:rPr>
+      </w:pPr>
+      <w:r>
+        <w:rPr>
+          <w:b/>
+          <w:bCs/>
+        </w:rPr>
+        <w:t>Klíčová slova</w:t>
+      </w:r>
+    </w:p>
+    <w:p>
+      <w:r>
+        <w:t>Id</w:t>
+      </w:r>
+    </w:p>
+    <w:p>
+      <w:r>
+        <w:t>Account_ID</w:t>
+      </w:r>
+    </w:p>
+    <w:p>
+      <w:r>
+        <w:t>Text</w:t>
+      </w:r>
+    </w:p>
+    <w:p/>
+    <w:p>
+      <w:pPr>
+        <w:rPr>
+          <w:b/>
+          <w:bCs/>
+        </w:rPr>
+      </w:pPr>
+      <w:r>
+        <w:rPr>
+          <w:b/>
+          <w:bCs/>
+        </w:rPr>
+        <w:t>Obrázek</w:t>
+      </w:r>
+    </w:p>
+    <w:p>
+      <w:r>
+        <w:t>Id</w:t>
       </w:r>
     </w:p>
     <w:p>
@@ -222,287 +493,34 @@
     </w:p>
     <w:p>
       <w:r>
-        <w:t>Text</w:t>
-      </w:r>
-    </w:p>
-    <w:p/>
-    <w:p>
-      <w:r>
-        <w:rPr>
-          <w:b/>
-          <w:bCs/>
-        </w:rPr>
-        <w:t>Zkušenost</w:t>
-      </w:r>
-    </w:p>
-    <w:p>
-      <w:r>
-        <w:t>Id</w:t>
-      </w:r>
-    </w:p>
-    <w:p>
-      <w:r>
-        <w:t>Účet_ID</w:t>
-      </w:r>
-    </w:p>
-    <w:p>
-      <w:r>
-        <w:t>Text</w:t>
-      </w:r>
-    </w:p>
-    <w:p>
-      <w:r>
-        <w:t>Procento</w:t>
-      </w:r>
-    </w:p>
-    <w:p/>
-    <w:p>
-      <w:pPr>
-        <w:rPr>
-          <w:b/>
-          <w:bCs/>
-        </w:rPr>
-      </w:pPr>
-      <w:r>
-        <w:rPr>
-          <w:b/>
-          <w:bCs/>
-        </w:rPr>
-        <w:t>Chat</w:t>
-      </w:r>
-      <w:r>
-        <w:rPr>
-          <w:b/>
-          <w:bCs/>
-        </w:rPr>
-        <w:t xml:space="preserve"> – Spojovací tabulka</w:t>
-      </w:r>
-    </w:p>
-    <w:p>
-      <w:r>
-        <w:t>Id</w:t>
-      </w:r>
-    </w:p>
-    <w:p>
-      <w:r>
-        <w:t>Účet_ID_1</w:t>
-      </w:r>
-    </w:p>
-    <w:p>
-      <w:r>
-        <w:t>Účet_ID_2</w:t>
-      </w:r>
-    </w:p>
-    <w:p/>
-    <w:p>
-      <w:r>
-        <w:rPr>
-          <w:b/>
-          <w:bCs/>
-        </w:rPr>
-        <w:t>Chat</w:t>
-      </w:r>
-    </w:p>
-    <w:p>
-      <w:r>
-        <w:t>Id</w:t>
-      </w:r>
-    </w:p>
-    <w:p>
-      <w:r>
-        <w:t>Chat_ID</w:t>
-      </w:r>
-    </w:p>
-    <w:p>
-      <w:r>
-        <w:t>Datum a čas</w:t>
-      </w:r>
-    </w:p>
-    <w:p>
-      <w:r>
-        <w:t>Text</w:t>
-      </w:r>
-    </w:p>
-    <w:p/>
-    <w:p>
-      <w:pPr>
-        <w:rPr>
-          <w:b/>
-          <w:bCs/>
-        </w:rPr>
-      </w:pPr>
-      <w:r>
-        <w:rPr>
-          <w:b/>
-          <w:bCs/>
-        </w:rPr>
-        <w:t>Hodnocení</w:t>
-      </w:r>
-    </w:p>
-    <w:p>
-      <w:r>
-        <w:t>Id</w:t>
-      </w:r>
-    </w:p>
-    <w:p>
-      <w:r>
-        <w:t>Zkušenost</w:t>
-      </w:r>
-      <w:r>
-        <w:t xml:space="preserve">_ID </w:t>
-      </w:r>
-      <w:r>
-        <w:t>(Adresát)</w:t>
-      </w:r>
-    </w:p>
-    <w:p>
-      <w:r>
-        <w:t>Datum a čas</w:t>
-      </w:r>
-    </w:p>
-    <w:p>
-      <w:r>
-        <w:t>Procento</w:t>
-      </w:r>
-    </w:p>
-    <w:p>
-      <w:r>
-        <w:t>Popis</w:t>
-      </w:r>
-    </w:p>
-    <w:p>
-      <w:r>
-        <w:t>Účet_ID (Hodnotitel)</w:t>
-      </w:r>
-    </w:p>
-    <w:p/>
-    <w:p>
-      <w:pPr>
-        <w:rPr>
-          <w:b/>
-          <w:bCs/>
-        </w:rPr>
-      </w:pPr>
-      <w:r>
-        <w:rPr>
-          <w:b/>
-          <w:bCs/>
-        </w:rPr>
-        <w:t>Pracovní vztah</w:t>
-      </w:r>
-    </w:p>
-    <w:p>
-      <w:r>
-        <w:lastRenderedPageBreak/>
-        <w:t>Id</w:t>
-      </w:r>
-    </w:p>
-    <w:p>
-      <w:r>
-        <w:t>Účet_ID_1</w:t>
-      </w:r>
-    </w:p>
-    <w:p>
-      <w:r>
-        <w:t>Účet_ID_2</w:t>
-      </w:r>
-    </w:p>
-    <w:p/>
-    <w:p>
-      <w:pPr>
-        <w:rPr>
-          <w:b/>
-          <w:bCs/>
-        </w:rPr>
-      </w:pPr>
-      <w:r>
-        <w:rPr>
-          <w:b/>
-          <w:bCs/>
-        </w:rPr>
-        <w:t>Pracovní období</w:t>
-      </w:r>
-    </w:p>
-    <w:p>
-      <w:r>
-        <w:t>Id</w:t>
-      </w:r>
-    </w:p>
-    <w:p>
-      <w:r>
-        <w:t>Pracovní_vztah_ID</w:t>
-      </w:r>
-    </w:p>
-    <w:p>
-      <w:r>
-        <w:t>Od (datum, povinný)</w:t>
-      </w:r>
-    </w:p>
-    <w:p>
-      <w:r>
-        <w:t>Do (datum, možnost null)</w:t>
-      </w:r>
-    </w:p>
-    <w:p/>
-    <w:p>
-      <w:pPr>
-        <w:rPr>
-          <w:b/>
-          <w:bCs/>
-        </w:rPr>
-      </w:pPr>
-      <w:r>
-        <w:rPr>
-          <w:b/>
-          <w:bCs/>
-        </w:rPr>
-        <w:t>Klíčová slova</w:t>
-      </w:r>
-    </w:p>
-    <w:p>
-      <w:r>
-        <w:t>Id</w:t>
-      </w:r>
-    </w:p>
-    <w:p>
-      <w:r>
-        <w:t>Account_ID</w:t>
-      </w:r>
-    </w:p>
-    <w:p>
-      <w:r>
-        <w:t>Text</w:t>
-      </w:r>
-    </w:p>
-    <w:p/>
-    <w:p>
-      <w:pPr>
-        <w:rPr>
-          <w:b/>
-          <w:bCs/>
-        </w:rPr>
-      </w:pPr>
-      <w:r>
-        <w:rPr>
-          <w:b/>
-          <w:bCs/>
-        </w:rPr>
-        <w:t>Obrázek</w:t>
-      </w:r>
-    </w:p>
-    <w:p>
-      <w:r>
-        <w:t>Id</w:t>
-      </w:r>
-    </w:p>
-    <w:p>
-      <w:r>
-        <w:t>Účet_ID</w:t>
-      </w:r>
-    </w:p>
-    <w:p>
-      <w:r>
-        <w:t>Obrázek</w:t>
+        <w:t>Název souboru</w:t>
+      </w:r>
+    </w:p>
+    <w:p>
+      <w:r>
+        <w:t xml:space="preserve">Picture </w:t>
+      </w:r>
+      <w:r>
+        <w:t>D</w:t>
+      </w:r>
+      <w:r>
+        <w:t>ata</w:t>
+      </w:r>
+    </w:p>
+    <w:p>
+      <w:r>
+        <w:t xml:space="preserve">Content </w:t>
+      </w:r>
+      <w:r>
+        <w:t>T</w:t>
+      </w:r>
+      <w:r>
+        <w:t>ype</w:t>
+      </w:r>
+    </w:p>
+    <w:p>
+      <w:r>
+        <w:t>Velikost</w:t>
       </w:r>
     </w:p>
     <w:p/>

</xml_diff>